<commit_message>
Version 0.31.0 : surpopulation qui se résorbe, salves de missiles en barrage
- surpopulation : perte de 1,5 × (pop/plafond − 1) par seconde (× 3 → −3/s,
  puis de plus en plus lentement) ; taux de croissance négatif affiché
- missiles : chaque missile vise son propre point, motif = disposition des
  silos tireurs (les silos tournés vers la cible tirent d'abord) ;
  un petit viseur par missile pendant la visée
- document de design mis à jour

Co-Authored-By: Claude Opus 5.5 <noreply@anthropic.com>
Claude-Session: https://claude.ai/code/session_011opmMeAVJgHDCpbrdjH1ST
</commit_message>
<xml_diff>
--- a/docs/Solar Conquest - Game Design.docx
+++ b/docs/Solar Conquest - Game Design.docx
@@ -1172,6 +1172,19 @@
       <w:r>
         <w:rPr>
           <w:rFonts w:ascii="Georgia" w:cs="Georgia" w:eastAsia="SimSun" w:hAnsi="Georgia"/>
+          <w:sz w:val="23"/>
+          <w:szCs w:val="23"/>
+        </w:rPr>
+        <w:t>Surpopulation : au-dessus du plafond (colons débarqués, garnisons), la population décroît d'elle-même, d'autant plus vite que l'excédent est grand : perte de 1,5 × (population / plafond − 1) par seconde, soit environ −3/s à trois fois le plafond, puis de plus en plus lentement en approchant du plafond. Un débarquement doit donc être exploité vite (tête de pont), et l'on ne peut plus accumuler indéfiniment de la population sur une planète.</w:t>
+      </w:r>
+    </w:p>
+    <w:p>
+      <w:pPr>
+        <w:spacing w:after="150" w:line="300"/>
+      </w:pPr>
+      <w:r>
+        <w:rPr>
+          <w:rFonts w:ascii="Georgia" w:cs="Georgia" w:eastAsia="SimSun" w:hAnsi="Georgia"/>
           <w:b/>
           <w:bCs/>
           <w:sz w:val="23"/>
@@ -2178,7 +2191,7 @@
           <w:sz w:val="23"/>
           <w:szCs w:val="23"/>
         </w:rPr>
-        <w:t xml:space="preserve">Visée manuelle : le joueur clique un point de la carte ; le missile corrige son cap vers la cible à 1,5 rad/s. Une marge de dépassement (25 unités, ou 150 en éloignement) évite à la fois les trajectoires droites et les orbites infinies autour de la cible.</w:t>
+        <w:t>Visée manuelle par salve : le joueur vise un point de la carte et chaque missile reçoit son propre point d'impact. Les silos tournés vers la cible tirent en premier ; le motif des impacts reproduit leur disposition (décalage de chaque silo par rapport au centre de la salve), ce qui produit des barrages plutôt que des tirs en file. Pendant la visée, un petit viseur par missile montre où il frappera. Chaque missile corrige son cap vers son point à 1,5 rad/s ; une marge de dépassement (25 unités, ou 150 en éloignement) évite à la fois les trajectoires droites et les orbites infinies autour de la cible.</w:t>
       </w:r>
     </w:p>
     <w:p>

</xml_diff>

<commit_message>
Version 0.32.0 : comptes joueurs (Supabase, e-mail + mot de passe)
- inscription, connexion, mot de passe oublié, déconnexion, fiche « Mon compte »
- le serveur vérifie le jeton du joueur, réserve les pseudos des comptes
  et enregistre les parties en ligne terminées (historique + statistiques)
- supabase/schema.sql : tables profiles, player_stats, matches, fonctions
- comptes désactivés tant que config.js / Render ne sont pas configurés

Co-Authored-By: Claude Opus 5.5 <noreply@anthropic.com>
Claude-Session: https://claude.ai/code/session_011opmMeAVJgHDCpbrdjH1ST
</commit_message>
<xml_diff>
--- a/docs/Solar Conquest - Game Design.docx
+++ b/docs/Solar Conquest - Game Design.docx
@@ -3092,7 +3092,29 @@
           <w:sz w:val="23"/>
           <w:szCs w:val="23"/>
         </w:rPr>
-        <w:t>Comptes (facultatifs) : un compte conserve les statistiques du joueur. Connexion ou inscription par Google, ou par e-mail et mot de passe (8 caractères minimum ; à l'inscription, pseudo et confirmation du mot de passe).</w:t>
+        <w:t>Comptes (facultatifs) : inscription par e-mail et mot de passe (8 caractères minimum, pseudo de 2 à 16 caractères, confirmation du mot de passe), connexion, « mot de passe oublié » par lien reçu par e-mail, déconnexion. Un compte réserve le pseudo (un invité ne peut pas le prendre, sans distinction de majuscules) et conserve les statistiques des parties en ligne terminées : parties jouées, victoires, taux de victoire, visibles dans « Mon compte ». La connexion Google viendra ensuite.</w:t>
+      </w:r>
+      <w:r>
+        <w:rPr>
+          <w:rFonts w:ascii="Georgia" w:cs="Georgia" w:eastAsia="SimSun" w:hAnsi="Georgia"/>
+          <w:sz w:val="23"/>
+          <w:szCs w:val="23"/>
+        </w:rPr>
+      </w:r>
+    </w:p>
+    <w:p>
+      <w:pPr>
+        <w:spacing w:after="150" w:line="300"/>
+      </w:pPr>
+      <w:r>
+        <w:rPr>
+          <w:rFonts w:ascii="Georgia" w:cs="Georgia" w:eastAsia="SimSun" w:hAnsi="Georgia"/>
+          <w:b/>
+          <w:bCs/>
+          <w:sz w:val="23"/>
+          <w:szCs w:val="23"/>
+        </w:rPr>
+        <w:t>Technique : les comptes sont gérés par Supabase (authentification et base de données Postgres). Le jeu parle directement à Supabase avec la clé publique du projet ; le serveur de jeu vérifie le jeton de connexion de chaque joueur et enregistre les parties avec la clé secrète (variable d'environnement sur Render). Tables : profiles (pseudo unique), player_stats, matches (cf. supabase/schema.sql).</w:t>
       </w:r>
       <w:r>
         <w:rPr>

</xml_diff>

<commit_message>
0.33.0 : zoom stratégique, construction sans viser, vue d'ensemble
- Planètes agrandies quand on dézoome, avec anneau des propriétaires ;
  territoires cliquables sans zoomer
- Pose des bâtiments à l'emplacement proposé (fantôme), Maj + clic : manuel
- Liste « Mes planètes » avec alertes, Tab pour passer de l'une à l'autre
- Mini-carte cliquable, flèches d'alerte au bord de l'écran

Co-Authored-By: Claude Opus 5.5 <noreply@anthropic.com>
Claude-Session: https://claude.ai/code/session_011opmMeAVJgHDCpbrdjH1ST
</commit_message>
<xml_diff>
--- a/docs/Solar Conquest - Game Design.docx
+++ b/docs/Solar Conquest - Game Design.docx
@@ -794,6 +794,42 @@
           <w:sz w:val="23"/>
           <w:szCs w:val="23"/>
         </w:rPr>
+        <w:t>Construction sans viser : après le choix d'un bâtiment (bouton ou touche 1–9), un simple clic sur la planète le construit à l'emplacement proposé par le jeu, montré par un bâtiment fantôme (industries, villes et ports loin du front ; silos groupés et à l'abri ; bases militaires à environ trois territoires du front ; boucliers là où ils couvrent le plus de bâtiments non protégés ; DAA réparties). Maj + clic : choisir soi-même le territoire.</w:t>
+      </w:r>
+    </w:p>
+    <w:p>
+      <w:pPr>
+        <w:pStyle w:val="ListParagraph"/>
+        <w:numPr>
+          <w:ilvl w:val="0"/>
+          <w:numId w:val="2"/>
+        </w:numPr>
+        <w:spacing w:after="60" w:line="280"/>
+      </w:pPr>
+      <w:r>
+        <w:rPr>
+          <w:rFonts w:ascii="Georgia" w:cs="Georgia" w:eastAsia="SimSun" w:hAnsi="Georgia"/>
+          <w:sz w:val="23"/>
+          <w:szCs w:val="23"/>
+        </w:rPr>
+        <w:t>Tab / Maj + Tab : passer à la planète suivante / précédente parmi les siennes.</w:t>
+      </w:r>
+    </w:p>
+    <w:p>
+      <w:pPr>
+        <w:pStyle w:val="ListParagraph"/>
+        <w:numPr>
+          <w:ilvl w:val="0"/>
+          <w:numId w:val="2"/>
+        </w:numPr>
+        <w:spacing w:after="60" w:line="280"/>
+      </w:pPr>
+      <w:r>
+        <w:rPr>
+          <w:rFonts w:ascii="Georgia" w:cs="Georgia" w:eastAsia="SimSun" w:hAnsi="Georgia"/>
+          <w:sz w:val="23"/>
+          <w:szCs w:val="23"/>
+        </w:rPr>
         <w:t xml:space="preserve">Échap : annule visée de missile, pose de bâtiment ou sélection.</w:t>
       </w:r>
     </w:p>
@@ -920,6 +956,78 @@
           <w:szCs w:val="23"/>
         </w:rPr>
         <w:t xml:space="preserve">Panneau de sélection contextuel au-dessus de la barre de construction (informations sur le territoire cliqué).</w:t>
+      </w:r>
+    </w:p>
+    <w:p>
+      <w:pPr>
+        <w:pStyle w:val="ListParagraph"/>
+        <w:numPr>
+          <w:ilvl w:val="0"/>
+          <w:numId w:val="2"/>
+        </w:numPr>
+        <w:spacing w:after="60" w:line="280"/>
+      </w:pPr>
+      <w:r>
+        <w:rPr>
+          <w:rFonts w:ascii="Georgia" w:cs="Georgia" w:eastAsia="SimSun" w:hAnsi="Georgia"/>
+          <w:sz w:val="23"/>
+          <w:szCs w:val="23"/>
+        </w:rPr>
+        <w:t>Zoom stratégique : quand on dézoome, chaque planète est agrandie autour de son centre pour rester lisible (au moins ~46 px de rayon à l'écran, sans chevaucher le soleil ni ses voisines). Un anneau épais aux couleurs des propriétaires montre qui tient quoi, les territoires attaqués clignotent, et l'on peut toujours cliquer un territoire (attaque, construction) sans zoomer.</w:t>
+      </w:r>
+    </w:p>
+    <w:p>
+      <w:pPr>
+        <w:pStyle w:val="ListParagraph"/>
+        <w:numPr>
+          <w:ilvl w:val="0"/>
+          <w:numId w:val="2"/>
+        </w:numPr>
+        <w:spacing w:after="60" w:line="280"/>
+      </w:pPr>
+      <w:r>
+        <w:rPr>
+          <w:rFonts w:ascii="Georgia" w:cs="Georgia" w:eastAsia="SimSun" w:hAnsi="Georgia"/>
+          <w:sz w:val="23"/>
+          <w:szCs w:val="23"/>
+        </w:rPr>
+        <w:t>Mes planètes, sous le tableau des joueurs : liste cliquable des planètes où l'on possède des territoires (nombre de territoires, population), avec les alertes COMBAT (territoire attaqué) et « n EN APPROCHE » (missiles ou modules ennemis visant la planète).</w:t>
+      </w:r>
+    </w:p>
+    <w:p>
+      <w:pPr>
+        <w:pStyle w:val="ListParagraph"/>
+        <w:numPr>
+          <w:ilvl w:val="0"/>
+          <w:numId w:val="2"/>
+        </w:numPr>
+        <w:spacing w:after="60" w:line="280"/>
+      </w:pPr>
+      <w:r>
+        <w:rPr>
+          <w:rFonts w:ascii="Georgia" w:cs="Georgia" w:eastAsia="SimSun" w:hAnsi="Georgia"/>
+          <w:sz w:val="23"/>
+          <w:szCs w:val="23"/>
+        </w:rPr>
+        <w:t>Mini-carte, en bas à droite au-dessus de la barre de lancement : soleil, orbites, planètes avec l'anneau des propriétaires, planète verrouillée, planètes attaquées (cercle rouge pulsant), missiles et modules en vol (menaces en rouge / orange) et la zone visible. Clic sur une planète : on s'y rend ; ailleurs : la caméra y va.</w:t>
+      </w:r>
+    </w:p>
+    <w:p>
+      <w:pPr>
+        <w:pStyle w:val="ListParagraph"/>
+        <w:numPr>
+          <w:ilvl w:val="0"/>
+          <w:numId w:val="2"/>
+        </w:numPr>
+        <w:spacing w:after="60" w:line="280"/>
+      </w:pPr>
+      <w:r>
+        <w:rPr>
+          <w:rFonts w:ascii="Georgia" w:cs="Georgia" w:eastAsia="SimSun" w:hAnsi="Georgia"/>
+          <w:sz w:val="23"/>
+          <w:szCs w:val="23"/>
+        </w:rPr>
+        <w:t>Alertes au bord de l'écran : une flèche rouge (MISSILE) ou orange (COLONS) indique la direction de chaque menace hors de l'écran qui vise une de ses planètes ; une planète attaquée hors de l'écran est signalée par un repère rouge à son nom.</w:t>
       </w:r>
     </w:p>
     <w:p>

</xml_diff>

<commit_message>
0.34.0 : coût des envois (missiles 50 $, colonisation 1000 $), salve au maximum par défaut, orbites plus visibles
Co-Authored-By: Claude Opus 5.5 <noreply@anthropic.com>
Claude-Session: https://claude.ai/code/session_011opmMeAVJgHDCpbrdjH1ST
</commit_message>
<xml_diff>
--- a/docs/Solar Conquest - Game Design.docx
+++ b/docs/Solar Conquest - Game Design.docx
@@ -2281,6 +2281,24 @@
           <w:sz w:val="23"/>
           <w:szCs w:val="23"/>
         </w:rPr>
+        <w:t>Coût : 50 $ par envoi (une salve, quel que soit le nombre de missiles). Par défaut, la salve comprend tous les missiles prêts de la planète (affiché « n MAX ») ; les boutons − et + permettent d'en tirer moins.</w:t>
+      </w:r>
+    </w:p>
+    <w:p>
+      <w:pPr>
+        <w:pStyle w:val="ListParagraph"/>
+        <w:numPr>
+          <w:ilvl w:val="0"/>
+          <w:numId w:val="2"/>
+        </w:numPr>
+        <w:spacing w:after="60" w:line="280"/>
+      </w:pPr>
+      <w:r>
+        <w:rPr>
+          <w:rFonts w:ascii="Georgia" w:cs="Georgia" w:eastAsia="SimSun" w:hAnsi="Georgia"/>
+          <w:sz w:val="23"/>
+          <w:szCs w:val="23"/>
+        </w:rPr>
         <w:t xml:space="preserve">Trajectoire courbée par la gravité du soleil (constante 250 000) et des planètes (20 000, pondérée par la taille), avec adoucissement anti-singularité.</w:t>
       </w:r>
     </w:p>
@@ -2401,6 +2419,24 @@
           <w:szCs w:val="23"/>
         </w:rPr>
         <w:t xml:space="preserve">Condition : un centre de colonisation sur la planète verrouillée ; le bouton « Lancement colonisation » apparaît à côté du bouton de missiles.</w:t>
+      </w:r>
+    </w:p>
+    <w:p>
+      <w:pPr>
+        <w:pStyle w:val="ListParagraph"/>
+        <w:numPr>
+          <w:ilvl w:val="0"/>
+          <w:numId w:val="2"/>
+        </w:numPr>
+        <w:spacing w:after="60" w:line="280"/>
+      </w:pPr>
+      <w:r>
+        <w:rPr>
+          <w:rFonts w:ascii="Georgia" w:cs="Georgia" w:eastAsia="SimSun" w:hAnsi="Georgia"/>
+          <w:sz w:val="23"/>
+          <w:szCs w:val="23"/>
+        </w:rPr>
+        <w:t>Coût : 1 000 $ par envoi de module de colonisation, en plus des colons prélevés.</w:t>
       </w:r>
     </w:p>
     <w:p>

</xml_diff>

<commit_message>
0.35.0 : tutoriel « Comment jouer ? » illustré dans le menu, missiles à 50 $ pièce
Co-Authored-By: Claude Opus 5.5 <noreply@anthropic.com>
Claude-Session: https://claude.ai/code/session_011opmMeAVJgHDCpbrdjH1ST
</commit_message>
<xml_diff>
--- a/docs/Solar Conquest - Game Design.docx
+++ b/docs/Solar Conquest - Game Design.docx
@@ -2281,7 +2281,7 @@
           <w:sz w:val="23"/>
           <w:szCs w:val="23"/>
         </w:rPr>
-        <w:t>Coût : 50 $ par envoi (une salve, quel que soit le nombre de missiles). Par défaut, la salve comprend tous les missiles prêts de la planète (affiché « n MAX ») ; les boutons − et + permettent d'en tirer moins.</w:t>
+        <w:t>Coût : 50 $ par missile tiré. Par défaut, la salve comprend tous les missiles prêts de la planète que le joueur peut payer (affiché « n MAX ») ; les boutons − et + permettent d'en tirer moins. Si l'argent manque, la salve est réduite à ce qui est payable.</w:t>
       </w:r>
     </w:p>
     <w:p>
@@ -3200,6 +3200,21 @@
           <w:sz w:val="23"/>
           <w:szCs w:val="23"/>
         </w:rPr>
+      </w:r>
+    </w:p>
+    <w:p>
+      <w:pPr>
+        <w:spacing w:after="150" w:line="300"/>
+      </w:pPr>
+      <w:r>
+        <w:rPr>
+          <w:rFonts w:ascii="Georgia" w:cs="Georgia" w:eastAsia="SimSun" w:hAnsi="Georgia"/>
+          <w:b/>
+          <w:bCs/>
+          <w:sz w:val="23"/>
+          <w:szCs w:val="23"/>
+        </w:rPr>
+        <w:t>Comment jouer ? : un bouton sous le titre ouvre un tutoriel illustré (sommaire cliquable) : but du jeu et conditions de victoire, fondation, écran de jeu, argent et population, conquête, bâtiments, missiles et cratères, colonisation, gestion de plusieurs planètes, diplomatie, commandes. Les chiffres sont lus dans la configuration du jeu ; les illustrations sont des captures du jeu (tools/tuto_captures.py). À mettre à jour à chaque évolution.</w:t>
       </w:r>
     </w:p>
     <w:p>

</xml_diff>

<commit_message>
0.36.0 : interface en anglais par défaut, choix English / Français sur l'accueil
- Tous les textes dans client/js/i18n.js (T, txt, data-i18n)
- Le serveur envoie des clés traduites chez chaque joueur
- Tutoriel en deux langues, captures dans chaque langue
- Montants et pourcentages au format de la langue

Co-Authored-By: Claude Opus 5.5 <noreply@anthropic.com>
Claude-Session: https://claude.ai/code/session_011opmMeAVJgHDCpbrdjH1ST
</commit_message>
<xml_diff>
--- a/docs/Solar Conquest - Game Design.docx
+++ b/docs/Solar Conquest - Game Design.docx
@@ -3229,6 +3229,21 @@
           <w:sz w:val="23"/>
           <w:szCs w:val="23"/>
         </w:rPr>
+        <w:t>Langues : le jeu est en anglais par défaut ; un sélecteur English / Français en haut à gauche de l'accueil change toute l'interface (menus, jeu, messages, tutoriel) et le choix est mémorisé sur l'appareil. Tous les textes sont dans js/i18n.js ; le serveur envoie ses messages sous forme de clés, que chaque joueur affiche dans sa propre langue. Le tutoriel existe en deux versions, avec des captures dans chaque langue.</w:t>
+      </w:r>
+    </w:p>
+    <w:p>
+      <w:pPr>
+        <w:spacing w:after="150" w:line="300"/>
+      </w:pPr>
+      <w:r>
+        <w:rPr>
+          <w:rFonts w:ascii="Georgia" w:cs="Georgia" w:eastAsia="SimSun" w:hAnsi="Georgia"/>
+          <w:b/>
+          <w:bCs/>
+          <w:sz w:val="23"/>
+          <w:szCs w:val="23"/>
+        </w:rPr>
         <w:t>Créer une partie : nom, visibilité (publique : listée et joignable par code ; privée : joignable par code uniquement), nombre maximal de joueurs (2 à 6), nombre de planètes (5 à 9), et option « compléter les places libres avec des bots ». L'hôte arrive ensuite dans le salon d'attente : code en grand avec bouton de copie, options choisies, places occupées et libres, bouton « Lancer la partie ».</w:t>
       </w:r>
       <w:r>

</xml_diff>

<commit_message>
0.37.0 : encarts publicitaires (accueil, salon d'attente), prêts pour AdSense
Co-Authored-By: Claude Opus 5.5 <noreply@anthropic.com>
Claude-Session: https://claude.ai/code/session_011opmMeAVJgHDCpbrdjH1ST
</commit_message>
<xml_diff>
--- a/docs/Solar Conquest - Game Design.docx
+++ b/docs/Solar Conquest - Game Design.docx
@@ -3244,6 +3244,21 @@
           <w:sz w:val="23"/>
           <w:szCs w:val="23"/>
         </w:rPr>
+        <w:t>Publicité : deux encarts, uniquement dans le menu (jamais en partie) : une bannière horizontale (728 × 90, adaptable) sous les panneaux de l'accueil, et un rectangle (300 × 250) à côté du salon d'attente (dessous sur mobile). Régie prévue : Google AdSense, réglée dans CONFIG.ads (identifiant d'éditeur et identifiants des blocs) ; sans réglage, aucun encart. Le build génère ads.txt. En Europe, le message de consentement certifié de Google doit être activé dans AdSense. ?ads=demo affiche des encarts factices pour tester la mise en page.</w:t>
+      </w:r>
+    </w:p>
+    <w:p>
+      <w:pPr>
+        <w:spacing w:after="150" w:line="300"/>
+      </w:pPr>
+      <w:r>
+        <w:rPr>
+          <w:rFonts w:ascii="Georgia" w:cs="Georgia" w:eastAsia="SimSun" w:hAnsi="Georgia"/>
+          <w:b/>
+          <w:bCs/>
+          <w:sz w:val="23"/>
+          <w:szCs w:val="23"/>
+        </w:rPr>
         <w:t>Créer une partie : nom, visibilité (publique : listée et joignable par code ; privée : joignable par code uniquement), nombre maximal de joueurs (2 à 6), nombre de planètes (5 à 9), et option « compléter les places libres avec des bots ». L'hôte arrive ensuite dans le salon d'attente : code en grand avec bouton de copie, options choisies, places occupées et libres, bouton « Lancer la partie ».</w:t>
       </w:r>
       <w:r>

</xml_diff>